<commit_message>
Rebuild the place cards with Zhou
Word had the file open when the rename went through, so it was skipped.
Jojo Zhou and Tony Zhou now on their cards; no Tzu left anywhere.

gifts.docx is still open in Word and remains skipped - it carries no names,
so nothing in it is affected by any of this.

Co-Authored-By: Claude Opus 5 (1M context) <noreply@anthropic.com>
</commit_message>
<xml_diff>
--- a/print/place-cards.docx
+++ b/print/place-cards.docx
@@ -2002,7 +2002,7 @@
                             <w:color w:val="222D2A"/>
                             <w:sz w:val="40"/>
                           </w:rPr>
-                          <w:t>Tony Tzu</w:t>
+                          <w:t>Tony Zhou</w:t>
                         </w:r>
                       </w:p>
                       <w:p>
@@ -2107,7 +2107,7 @@
                             <w:color w:val="222D2A"/>
                             <w:sz w:val="40"/>
                           </w:rPr>
-                          <w:t>Jojo Tzu</w:t>
+                          <w:t>Jojo Zhou</w:t>
                         </w:r>
                       </w:p>
                       <w:p>

</xml_diff>